<commit_message>
kubernetes - installation updated
</commit_message>
<xml_diff>
--- a/Kubernetes/15-installation.docx
+++ b/Kubernetes/15-installation.docx
@@ -874,6 +874,7 @@
           <w:numId w:val="1"/>
         </w:numPr>
         <w:ind w:left="360"/>
+        <w:jc w:val="both"/>
         <w:rPr>
           <w:rFonts w:asciiTheme="majorBidi" w:hAnsiTheme="majorBidi" w:cstheme="majorBidi"/>
           <w:b/>
@@ -901,6 +902,7 @@
           <w:numId w:val="2"/>
         </w:numPr>
         <w:spacing w:after="40"/>
+        <w:jc w:val="both"/>
         <w:rPr>
           <w:rFonts w:asciiTheme="majorBidi" w:hAnsiTheme="majorBidi" w:cstheme="majorBidi"/>
           <w:b/>
@@ -942,6 +944,7 @@
       <w:pPr>
         <w:spacing w:after="100"/>
         <w:ind w:left="720"/>
+        <w:jc w:val="both"/>
         <w:rPr>
           <w:rFonts w:asciiTheme="majorBidi" w:hAnsiTheme="majorBidi" w:cstheme="majorBidi"/>
           <w:sz w:val="28"/>
@@ -965,6 +968,7 @@
           <w:numId w:val="2"/>
         </w:numPr>
         <w:spacing w:after="40"/>
+        <w:jc w:val="both"/>
         <w:rPr>
           <w:rFonts w:asciiTheme="majorBidi" w:hAnsiTheme="majorBidi" w:cstheme="majorBidi"/>
           <w:b/>
@@ -1023,6 +1027,7 @@
     <w:p>
       <w:pPr>
         <w:ind w:left="720"/>
+        <w:jc w:val="both"/>
         <w:rPr>
           <w:rFonts w:asciiTheme="majorBidi" w:hAnsiTheme="majorBidi" w:cstheme="majorBidi"/>
           <w:sz w:val="28"/>
@@ -1046,6 +1051,7 @@
           <w:numId w:val="3"/>
         </w:numPr>
         <w:ind w:left="360"/>
+        <w:jc w:val="both"/>
         <w:rPr>
           <w:rFonts w:asciiTheme="majorBidi" w:hAnsiTheme="majorBidi" w:cstheme="majorBidi"/>
           <w:b/>
@@ -1072,6 +1078,7 @@
           <w:ilvl w:val="0"/>
           <w:numId w:val="4"/>
         </w:numPr>
+        <w:jc w:val="both"/>
         <w:rPr>
           <w:rFonts w:asciiTheme="majorBidi" w:hAnsiTheme="majorBidi" w:cstheme="majorBidi"/>
           <w:b/>
@@ -1099,6 +1106,7 @@
           <w:numId w:val="5"/>
         </w:numPr>
         <w:ind w:left="1080"/>
+        <w:jc w:val="both"/>
         <w:rPr>
           <w:rFonts w:asciiTheme="majorBidi" w:hAnsiTheme="majorBidi" w:cstheme="majorBidi"/>
           <w:sz w:val="28"/>
@@ -1122,6 +1130,7 @@
           <w:numId w:val="5"/>
         </w:numPr>
         <w:ind w:left="1080"/>
+        <w:jc w:val="both"/>
         <w:rPr>
           <w:rFonts w:asciiTheme="majorBidi" w:hAnsiTheme="majorBidi" w:cstheme="majorBidi"/>
           <w:sz w:val="28"/>
@@ -1145,6 +1154,7 @@
           <w:numId w:val="5"/>
         </w:numPr>
         <w:ind w:left="1080"/>
+        <w:jc w:val="both"/>
         <w:rPr>
           <w:rFonts w:asciiTheme="majorBidi" w:hAnsiTheme="majorBidi" w:cstheme="majorBidi"/>
           <w:sz w:val="28"/>
@@ -1167,6 +1177,7 @@
           <w:ilvl w:val="0"/>
           <w:numId w:val="7"/>
         </w:numPr>
+        <w:jc w:val="both"/>
         <w:rPr>
           <w:rFonts w:asciiTheme="majorBidi" w:hAnsiTheme="majorBidi" w:cstheme="majorBidi"/>
           <w:b/>
@@ -1194,6 +1205,7 @@
           <w:numId w:val="6"/>
         </w:numPr>
         <w:ind w:left="1080"/>
+        <w:jc w:val="both"/>
         <w:rPr>
           <w:rFonts w:asciiTheme="majorBidi" w:hAnsiTheme="majorBidi" w:cstheme="majorBidi"/>
           <w:sz w:val="28"/>
@@ -1217,6 +1229,7 @@
           <w:numId w:val="6"/>
         </w:numPr>
         <w:ind w:left="1080"/>
+        <w:jc w:val="both"/>
         <w:rPr>
           <w:rFonts w:asciiTheme="majorBidi" w:hAnsiTheme="majorBidi" w:cstheme="majorBidi"/>
           <w:sz w:val="28"/>
@@ -1241,6 +1254,7 @@
         </w:numPr>
         <w:spacing w:after="60"/>
         <w:ind w:left="1080"/>
+        <w:jc w:val="both"/>
         <w:rPr>
           <w:rFonts w:asciiTheme="majorBidi" w:hAnsiTheme="majorBidi" w:cstheme="majorBidi"/>
           <w:sz w:val="28"/>
@@ -1259,6 +1273,7 @@
     <w:p>
       <w:pPr>
         <w:ind w:left="720"/>
+        <w:jc w:val="both"/>
         <w:rPr>
           <w:rFonts w:asciiTheme="majorBidi" w:hAnsiTheme="majorBidi" w:cstheme="majorBidi"/>
           <w:sz w:val="28"/>
@@ -1300,6 +1315,7 @@
           <w:numId w:val="8"/>
         </w:numPr>
         <w:ind w:left="360"/>
+        <w:jc w:val="both"/>
         <w:rPr>
           <w:rFonts w:asciiTheme="majorBidi" w:hAnsiTheme="majorBidi" w:cstheme="majorBidi"/>
           <w:b/>
@@ -1327,6 +1343,7 @@
           <w:ilvl w:val="0"/>
           <w:numId w:val="9"/>
         </w:numPr>
+        <w:jc w:val="both"/>
         <w:rPr>
           <w:rFonts w:asciiTheme="majorBidi" w:hAnsiTheme="majorBidi" w:cstheme="majorBidi"/>
           <w:sz w:val="28"/>
@@ -1376,6 +1393,7 @@
           <w:numId w:val="10"/>
         </w:numPr>
         <w:ind w:left="1080"/>
+        <w:jc w:val="both"/>
         <w:rPr>
           <w:rFonts w:asciiTheme="majorBidi" w:hAnsiTheme="majorBidi" w:cstheme="majorBidi"/>
           <w:sz w:val="28"/>
@@ -1399,6 +1417,7 @@
           <w:numId w:val="10"/>
         </w:numPr>
         <w:ind w:left="1080"/>
+        <w:jc w:val="both"/>
         <w:rPr>
           <w:rFonts w:asciiTheme="majorBidi" w:hAnsiTheme="majorBidi" w:cstheme="majorBidi"/>
           <w:sz w:val="28"/>
@@ -1432,6 +1451,7 @@
           <w:numId w:val="10"/>
         </w:numPr>
         <w:ind w:left="1080"/>
+        <w:jc w:val="both"/>
         <w:rPr>
           <w:rFonts w:asciiTheme="majorBidi" w:hAnsiTheme="majorBidi" w:cstheme="majorBidi"/>
           <w:sz w:val="28"/>
@@ -1455,6 +1475,7 @@
           <w:numId w:val="10"/>
         </w:numPr>
         <w:ind w:left="1080"/>
+        <w:jc w:val="both"/>
         <w:rPr>
           <w:rFonts w:asciiTheme="majorBidi" w:hAnsiTheme="majorBidi" w:cstheme="majorBidi"/>
           <w:sz w:val="28"/>
@@ -1479,6 +1500,7 @@
         </w:numPr>
         <w:spacing w:after="40"/>
         <w:ind w:left="1080"/>
+        <w:jc w:val="both"/>
         <w:rPr>
           <w:rFonts w:asciiTheme="majorBidi" w:hAnsiTheme="majorBidi" w:cstheme="majorBidi"/>
           <w:sz w:val="28"/>
@@ -1497,6 +1519,7 @@
     <w:p>
       <w:pPr>
         <w:ind w:left="720"/>
+        <w:jc w:val="both"/>
         <w:rPr>
           <w:rFonts w:asciiTheme="majorBidi" w:hAnsiTheme="majorBidi" w:cstheme="majorBidi"/>
           <w:sz w:val="28"/>
@@ -1520,6 +1543,7 @@
           <w:numId w:val="11"/>
         </w:numPr>
         <w:ind w:left="360"/>
+        <w:jc w:val="both"/>
         <w:rPr>
           <w:rFonts w:asciiTheme="majorBidi" w:hAnsiTheme="majorBidi" w:cstheme="majorBidi"/>
           <w:b/>
@@ -1546,6 +1570,7 @@
           <w:ilvl w:val="0"/>
           <w:numId w:val="12"/>
         </w:numPr>
+        <w:jc w:val="both"/>
         <w:rPr>
           <w:rFonts w:asciiTheme="majorBidi" w:hAnsiTheme="majorBidi" w:cstheme="majorBidi"/>
           <w:b/>
@@ -1573,6 +1598,7 @@
           <w:numId w:val="13"/>
         </w:numPr>
         <w:ind w:left="1080"/>
+        <w:jc w:val="both"/>
         <w:rPr>
           <w:rFonts w:asciiTheme="majorBidi" w:hAnsiTheme="majorBidi" w:cstheme="majorBidi"/>
           <w:sz w:val="28"/>
@@ -1596,6 +1622,7 @@
           <w:numId w:val="13"/>
         </w:numPr>
         <w:ind w:left="1080"/>
+        <w:jc w:val="both"/>
         <w:rPr>
           <w:rFonts w:asciiTheme="majorBidi" w:hAnsiTheme="majorBidi" w:cstheme="majorBidi"/>
           <w:sz w:val="28"/>
@@ -1619,6 +1646,7 @@
           <w:numId w:val="13"/>
         </w:numPr>
         <w:ind w:left="1080"/>
+        <w:jc w:val="both"/>
         <w:rPr>
           <w:rFonts w:asciiTheme="majorBidi" w:hAnsiTheme="majorBidi" w:cstheme="majorBidi"/>
           <w:sz w:val="28"/>
@@ -1664,6 +1692,7 @@
           <w:numId w:val="13"/>
         </w:numPr>
         <w:ind w:left="1080"/>
+        <w:jc w:val="both"/>
         <w:rPr>
           <w:rFonts w:asciiTheme="majorBidi" w:hAnsiTheme="majorBidi" w:cstheme="majorBidi"/>
           <w:sz w:val="28"/>
@@ -1713,6 +1742,7 @@
           <w:numId w:val="14"/>
         </w:numPr>
         <w:spacing w:after="20"/>
+        <w:jc w:val="both"/>
         <w:rPr>
           <w:rFonts w:asciiTheme="majorBidi" w:hAnsiTheme="majorBidi" w:cstheme="majorBidi"/>
           <w:b/>
@@ -1735,6 +1765,7 @@
     <w:p>
       <w:pPr>
         <w:ind w:left="720"/>
+        <w:jc w:val="both"/>
         <w:rPr>
           <w:rFonts w:asciiTheme="majorBidi" w:hAnsiTheme="majorBidi" w:cstheme="majorBidi"/>
           <w:sz w:val="28"/>
@@ -2140,24 +2171,27 @@
     </w:p>
     <w:p>
       <w:pPr>
-        <w:rPr>
-          <w:rFonts w:asciiTheme="majorBidi" w:hAnsiTheme="majorBidi" w:cstheme="majorBidi"/>
-          <w:sz w:val="28"/>
-          <w:szCs w:val="28"/>
-        </w:rPr>
-      </w:pPr>
-    </w:p>
-    <w:p>
-      <w:pPr>
-        <w:rPr>
-          <w:rFonts w:asciiTheme="majorBidi" w:hAnsiTheme="majorBidi" w:cstheme="majorBidi"/>
-          <w:sz w:val="28"/>
-          <w:szCs w:val="28"/>
-        </w:rPr>
-      </w:pPr>
-    </w:p>
-    <w:p>
-      <w:pPr>
+        <w:jc w:val="both"/>
+        <w:rPr>
+          <w:rFonts w:asciiTheme="majorBidi" w:hAnsiTheme="majorBidi" w:cstheme="majorBidi"/>
+          <w:sz w:val="28"/>
+          <w:szCs w:val="28"/>
+        </w:rPr>
+      </w:pPr>
+    </w:p>
+    <w:p>
+      <w:pPr>
+        <w:jc w:val="both"/>
+        <w:rPr>
+          <w:rFonts w:asciiTheme="majorBidi" w:hAnsiTheme="majorBidi" w:cstheme="majorBidi"/>
+          <w:sz w:val="28"/>
+          <w:szCs w:val="28"/>
+        </w:rPr>
+      </w:pPr>
+    </w:p>
+    <w:p>
+      <w:pPr>
+        <w:jc w:val="both"/>
         <w:rPr>
           <w:rFonts w:asciiTheme="majorBidi" w:hAnsiTheme="majorBidi" w:cstheme="majorBidi"/>
           <w:sz w:val="4"/>
@@ -2169,6 +2203,7 @@
       <w:pPr>
         <w:spacing w:after="100"/>
         <w:ind w:left="720"/>
+        <w:jc w:val="both"/>
         <w:rPr>
           <w:rFonts w:asciiTheme="majorBidi" w:hAnsiTheme="majorBidi" w:cstheme="majorBidi"/>
           <w:sz w:val="28"/>
@@ -2192,6 +2227,7 @@
           <w:numId w:val="15"/>
         </w:numPr>
         <w:ind w:left="360"/>
+        <w:jc w:val="both"/>
         <w:rPr>
           <w:rFonts w:asciiTheme="majorBidi" w:hAnsiTheme="majorBidi" w:cstheme="majorBidi"/>
           <w:b/>
@@ -2218,6 +2254,7 @@
           <w:ilvl w:val="0"/>
           <w:numId w:val="16"/>
         </w:numPr>
+        <w:jc w:val="both"/>
         <w:rPr>
           <w:rFonts w:asciiTheme="majorBidi" w:hAnsiTheme="majorBidi" w:cstheme="majorBidi"/>
           <w:sz w:val="28"/>
@@ -2250,6 +2287,7 @@
           <w:ilvl w:val="0"/>
           <w:numId w:val="16"/>
         </w:numPr>
+        <w:jc w:val="both"/>
         <w:rPr>
           <w:rFonts w:asciiTheme="majorBidi" w:hAnsiTheme="majorBidi" w:cstheme="majorBidi"/>
           <w:sz w:val="28"/>
@@ -2284,6 +2322,7 @@
         </w:numPr>
         <w:spacing w:after="20"/>
         <w:ind w:left="360"/>
+        <w:jc w:val="both"/>
         <w:rPr>
           <w:rFonts w:asciiTheme="majorBidi" w:hAnsiTheme="majorBidi" w:cstheme="majorBidi"/>
           <w:b/>
@@ -2307,6 +2346,7 @@
       <w:pPr>
         <w:spacing w:after="120"/>
         <w:ind w:left="360"/>
+        <w:jc w:val="both"/>
         <w:rPr>
           <w:rFonts w:asciiTheme="majorBidi" w:hAnsiTheme="majorBidi" w:cstheme="majorBidi"/>
           <w:sz w:val="28"/>
@@ -3302,6 +3342,7 @@
       <w:pPr>
         <w:spacing w:after="80"/>
         <w:ind w:left="360"/>
+        <w:jc w:val="both"/>
         <w:rPr>
           <w:rFonts w:asciiTheme="majorBidi" w:hAnsiTheme="majorBidi" w:cstheme="majorBidi"/>
           <w:sz w:val="28"/>
@@ -3325,6 +3366,7 @@
           <w:numId w:val="36"/>
         </w:numPr>
         <w:ind w:left="720"/>
+        <w:jc w:val="both"/>
         <w:rPr>
           <w:rFonts w:asciiTheme="majorBidi" w:hAnsiTheme="majorBidi" w:cstheme="majorBidi"/>
           <w:b/>
@@ -3351,35 +3393,20 @@
           <w:ilvl w:val="0"/>
           <w:numId w:val="37"/>
         </w:numPr>
-        <w:rPr>
-          <w:rFonts w:asciiTheme="majorBidi" w:hAnsiTheme="majorBidi" w:cstheme="majorBidi"/>
-          <w:sz w:val="28"/>
-          <w:szCs w:val="28"/>
-        </w:rPr>
-      </w:pPr>
-      <w:r>
-        <w:rPr>
-          <w:rFonts w:asciiTheme="majorBidi" w:hAnsiTheme="majorBidi" w:cstheme="majorBidi"/>
-          <w:sz w:val="28"/>
-          <w:szCs w:val="28"/>
-        </w:rPr>
-        <w:t>Master</w:t>
-      </w:r>
-      <w:r>
-        <w:rPr>
-          <w:rFonts w:asciiTheme="majorBidi" w:hAnsiTheme="majorBidi" w:cstheme="majorBidi"/>
-          <w:sz w:val="28"/>
-          <w:szCs w:val="28"/>
-        </w:rPr>
-        <w:t xml:space="preserve"> </w:t>
-      </w:r>
-      <w:r>
-        <w:rPr>
-          <w:rFonts w:asciiTheme="majorBidi" w:hAnsiTheme="majorBidi" w:cstheme="majorBidi"/>
-          <w:sz w:val="28"/>
-          <w:szCs w:val="28"/>
-        </w:rPr>
-        <w:t xml:space="preserve">→ </w:t>
+        <w:jc w:val="both"/>
+        <w:rPr>
+          <w:rFonts w:asciiTheme="majorBidi" w:hAnsiTheme="majorBidi" w:cstheme="majorBidi"/>
+          <w:sz w:val="28"/>
+          <w:szCs w:val="28"/>
+        </w:rPr>
+      </w:pPr>
+      <w:r>
+        <w:rPr>
+          <w:rFonts w:asciiTheme="majorBidi" w:hAnsiTheme="majorBidi" w:cstheme="majorBidi"/>
+          <w:sz w:val="28"/>
+          <w:szCs w:val="28"/>
+        </w:rPr>
+        <w:t xml:space="preserve">Master → </w:t>
       </w:r>
       <w:proofErr w:type="spellStart"/>
       <w:r>
@@ -3441,35 +3468,20 @@
           <w:ilvl w:val="0"/>
           <w:numId w:val="37"/>
         </w:numPr>
-        <w:rPr>
-          <w:rFonts w:asciiTheme="majorBidi" w:hAnsiTheme="majorBidi" w:cstheme="majorBidi"/>
-          <w:sz w:val="28"/>
-          <w:szCs w:val="28"/>
-        </w:rPr>
-      </w:pPr>
-      <w:r>
-        <w:rPr>
-          <w:rFonts w:asciiTheme="majorBidi" w:hAnsiTheme="majorBidi" w:cstheme="majorBidi"/>
-          <w:sz w:val="28"/>
-          <w:szCs w:val="28"/>
-        </w:rPr>
-        <w:t>Worker</w:t>
-      </w:r>
-      <w:r>
-        <w:rPr>
-          <w:rFonts w:asciiTheme="majorBidi" w:hAnsiTheme="majorBidi" w:cstheme="majorBidi"/>
-          <w:sz w:val="28"/>
-          <w:szCs w:val="28"/>
-        </w:rPr>
-        <w:t xml:space="preserve"> </w:t>
-      </w:r>
-      <w:r>
-        <w:rPr>
-          <w:rFonts w:asciiTheme="majorBidi" w:hAnsiTheme="majorBidi" w:cstheme="majorBidi"/>
-          <w:sz w:val="28"/>
-          <w:szCs w:val="28"/>
-        </w:rPr>
-        <w:t xml:space="preserve">→ </w:t>
+        <w:jc w:val="both"/>
+        <w:rPr>
+          <w:rFonts w:asciiTheme="majorBidi" w:hAnsiTheme="majorBidi" w:cstheme="majorBidi"/>
+          <w:sz w:val="28"/>
+          <w:szCs w:val="28"/>
+        </w:rPr>
+      </w:pPr>
+      <w:r>
+        <w:rPr>
+          <w:rFonts w:asciiTheme="majorBidi" w:hAnsiTheme="majorBidi" w:cstheme="majorBidi"/>
+          <w:sz w:val="28"/>
+          <w:szCs w:val="28"/>
+        </w:rPr>
+        <w:t xml:space="preserve">Worker → </w:t>
       </w:r>
       <w:proofErr w:type="spellStart"/>
       <w:r>
@@ -3532,6 +3544,7 @@
           <w:numId w:val="38"/>
         </w:numPr>
         <w:ind w:left="720"/>
+        <w:jc w:val="both"/>
         <w:rPr>
           <w:rFonts w:asciiTheme="majorBidi" w:hAnsiTheme="majorBidi" w:cstheme="majorBidi"/>
           <w:b/>
@@ -3558,6 +3571,7 @@
           <w:ilvl w:val="0"/>
           <w:numId w:val="39"/>
         </w:numPr>
+        <w:jc w:val="both"/>
         <w:rPr>
           <w:rFonts w:asciiTheme="majorBidi" w:hAnsiTheme="majorBidi" w:cstheme="majorBidi"/>
           <w:b/>
@@ -3628,6 +3642,7 @@
           <w:ilvl w:val="0"/>
           <w:numId w:val="39"/>
         </w:numPr>
+        <w:jc w:val="both"/>
         <w:rPr>
           <w:rFonts w:asciiTheme="majorBidi" w:hAnsiTheme="majorBidi" w:cstheme="majorBidi"/>
           <w:b/>
@@ -3700,6 +3715,7 @@
         </w:numPr>
         <w:spacing w:after="40"/>
         <w:ind w:left="720"/>
+        <w:jc w:val="both"/>
         <w:rPr>
           <w:rFonts w:asciiTheme="majorBidi" w:hAnsiTheme="majorBidi" w:cstheme="majorBidi"/>
           <w:b/>
@@ -3723,6 +3739,7 @@
       <w:pPr>
         <w:spacing w:after="40"/>
         <w:ind w:left="720"/>
+        <w:jc w:val="both"/>
         <w:rPr>
           <w:rFonts w:asciiTheme="majorBidi" w:hAnsiTheme="majorBidi" w:cstheme="majorBidi"/>
           <w:sz w:val="28"/>
@@ -3745,6 +3762,7 @@
           <w:ilvl w:val="0"/>
           <w:numId w:val="41"/>
         </w:numPr>
+        <w:jc w:val="both"/>
         <w:rPr>
           <w:rFonts w:asciiTheme="majorBidi" w:hAnsiTheme="majorBidi" w:cstheme="majorBidi"/>
           <w:sz w:val="28"/>
@@ -3765,15 +3783,7 @@
           <w:sz w:val="28"/>
           <w:szCs w:val="28"/>
         </w:rPr>
-        <w:t xml:space="preserve"> </w:t>
-      </w:r>
-      <w:r>
-        <w:rPr>
-          <w:rFonts w:asciiTheme="majorBidi" w:hAnsiTheme="majorBidi" w:cstheme="majorBidi"/>
-          <w:sz w:val="28"/>
-          <w:szCs w:val="28"/>
-        </w:rPr>
-        <w:t xml:space="preserve">→ </w:t>
+        <w:t xml:space="preserve"> → </w:t>
       </w:r>
       <w:proofErr w:type="spellStart"/>
       <w:r>
@@ -3802,6 +3812,7 @@
           <w:numId w:val="41"/>
         </w:numPr>
         <w:spacing w:after="40"/>
+        <w:jc w:val="both"/>
         <w:rPr>
           <w:rFonts w:asciiTheme="majorBidi" w:hAnsiTheme="majorBidi" w:cstheme="majorBidi"/>
           <w:sz w:val="28"/>
@@ -3822,15 +3833,7 @@
           <w:sz w:val="28"/>
           <w:szCs w:val="28"/>
         </w:rPr>
-        <w:t xml:space="preserve"> </w:t>
-      </w:r>
-      <w:r>
-        <w:rPr>
-          <w:rFonts w:asciiTheme="majorBidi" w:hAnsiTheme="majorBidi" w:cstheme="majorBidi"/>
-          <w:sz w:val="28"/>
-          <w:szCs w:val="28"/>
-        </w:rPr>
-        <w:t xml:space="preserve">→ </w:t>
+        <w:t xml:space="preserve"> → </w:t>
       </w:r>
       <w:proofErr w:type="spellStart"/>
       <w:r>
@@ -4340,48 +4343,29 @@
       <w:pPr>
         <w:spacing w:after="40"/>
         <w:ind w:left="720"/>
-        <w:rPr>
-          <w:rFonts w:asciiTheme="majorBidi" w:hAnsiTheme="majorBidi" w:cstheme="majorBidi"/>
-          <w:sz w:val="28"/>
-          <w:szCs w:val="28"/>
-        </w:rPr>
-      </w:pPr>
-      <w:r>
-        <w:rPr>
-          <w:rFonts w:asciiTheme="majorBidi" w:hAnsiTheme="majorBidi" w:cstheme="majorBidi"/>
-          <w:sz w:val="28"/>
-          <w:szCs w:val="28"/>
-        </w:rPr>
-        <w:t xml:space="preserve">Then </w:t>
-      </w:r>
-      <w:r>
-        <w:rPr>
-          <w:rFonts w:asciiTheme="majorBidi" w:hAnsiTheme="majorBidi" w:cstheme="majorBidi"/>
-          <w:sz w:val="28"/>
-          <w:szCs w:val="28"/>
-        </w:rPr>
-        <w:t>Lock the package</w:t>
-      </w:r>
-      <w:r>
-        <w:rPr>
-          <w:rFonts w:asciiTheme="majorBidi" w:hAnsiTheme="majorBidi" w:cstheme="majorBidi"/>
-          <w:sz w:val="28"/>
-          <w:szCs w:val="28"/>
-        </w:rPr>
-        <w:t xml:space="preserve"> o</w:t>
-      </w:r>
-      <w:r>
-        <w:rPr>
-          <w:rFonts w:asciiTheme="majorBidi" w:hAnsiTheme="majorBidi" w:cstheme="majorBidi"/>
-          <w:sz w:val="28"/>
-          <w:szCs w:val="28"/>
-        </w:rPr>
-        <w:t xml:space="preserve">therwise a normal </w:t>
+        <w:jc w:val="both"/>
+        <w:rPr>
+          <w:rFonts w:asciiTheme="majorBidi" w:hAnsiTheme="majorBidi" w:cstheme="majorBidi"/>
+          <w:sz w:val="28"/>
+          <w:szCs w:val="28"/>
+        </w:rPr>
+      </w:pPr>
+      <w:r>
+        <w:rPr>
+          <w:rFonts w:asciiTheme="majorBidi" w:hAnsiTheme="majorBidi" w:cstheme="majorBidi"/>
+          <w:sz w:val="28"/>
+          <w:szCs w:val="28"/>
+        </w:rPr>
+        <w:t xml:space="preserve">Then Lock the package otherwise a normal </w:t>
       </w:r>
       <w:proofErr w:type="spellStart"/>
       <w:r>
         <w:rPr>
           <w:rFonts w:asciiTheme="majorBidi" w:hAnsiTheme="majorBidi" w:cstheme="majorBidi"/>
+          <w:b/>
+          <w:bCs/>
+          <w:i/>
+          <w:iCs/>
           <w:sz w:val="28"/>
           <w:szCs w:val="28"/>
         </w:rPr>
@@ -4391,10 +4375,22 @@
       <w:r>
         <w:rPr>
           <w:rFonts w:asciiTheme="majorBidi" w:hAnsiTheme="majorBidi" w:cstheme="majorBidi"/>
-          <w:sz w:val="28"/>
-          <w:szCs w:val="28"/>
-        </w:rPr>
-        <w:t xml:space="preserve"> update will upgrade it to 28.5 or 29.x.</w:t>
+          <w:b/>
+          <w:bCs/>
+          <w:i/>
+          <w:iCs/>
+          <w:sz w:val="28"/>
+          <w:szCs w:val="28"/>
+        </w:rPr>
+        <w:t xml:space="preserve"> update</w:t>
+      </w:r>
+      <w:r>
+        <w:rPr>
+          <w:rFonts w:asciiTheme="majorBidi" w:hAnsiTheme="majorBidi" w:cstheme="majorBidi"/>
+          <w:sz w:val="28"/>
+          <w:szCs w:val="28"/>
+        </w:rPr>
+        <w:t xml:space="preserve"> will upgrade it to 28.5 or 29.x.</w:t>
       </w:r>
       <w:r>
         <w:rPr>
@@ -4530,6 +4526,7 @@
           <w:numId w:val="18"/>
         </w:numPr>
         <w:ind w:left="360"/>
+        <w:jc w:val="both"/>
         <w:rPr>
           <w:rFonts w:asciiTheme="majorBidi" w:hAnsiTheme="majorBidi" w:cstheme="majorBidi"/>
           <w:b/>
@@ -4553,6 +4550,7 @@
     <w:p>
       <w:pPr>
         <w:ind w:left="360"/>
+        <w:jc w:val="both"/>
         <w:rPr>
           <w:rFonts w:asciiTheme="majorBidi" w:hAnsiTheme="majorBidi" w:cstheme="majorBidi"/>
           <w:sz w:val="28"/>
@@ -4609,6 +4607,7 @@
     <w:p>
       <w:pPr>
         <w:ind w:left="360"/>
+        <w:jc w:val="both"/>
         <w:rPr>
           <w:rFonts w:asciiTheme="majorBidi" w:hAnsiTheme="majorBidi" w:cstheme="majorBidi"/>
           <w:b/>
@@ -4627,15 +4626,24 @@
         </w:rPr>
         <w:t xml:space="preserve">Check Docker's </w:t>
       </w:r>
-      <w:r>
-        <w:rPr>
-          <w:rFonts w:asciiTheme="majorBidi" w:hAnsiTheme="majorBidi" w:cstheme="majorBidi"/>
-          <w:sz w:val="28"/>
-          <w:szCs w:val="28"/>
-        </w:rPr>
-        <w:t xml:space="preserve">→ </w:t>
-      </w:r>
       <w:proofErr w:type="spellStart"/>
+      <w:r>
+        <w:rPr>
+          <w:rFonts w:asciiTheme="majorBidi" w:hAnsiTheme="majorBidi" w:cstheme="majorBidi"/>
+          <w:sz w:val="28"/>
+          <w:szCs w:val="28"/>
+        </w:rPr>
+        <w:t>cgroup</w:t>
+      </w:r>
+      <w:proofErr w:type="spellEnd"/>
+      <w:r>
+        <w:rPr>
+          <w:rFonts w:asciiTheme="majorBidi" w:hAnsiTheme="majorBidi" w:cstheme="majorBidi"/>
+          <w:sz w:val="28"/>
+          <w:szCs w:val="28"/>
+        </w:rPr>
+        <w:t xml:space="preserve"> driver</w:t>
+      </w:r>
       <w:r>
         <w:rPr>
           <w:rFonts w:asciiTheme="majorBidi" w:hAnsiTheme="majorBidi" w:cstheme="majorBidi"/>
@@ -4646,9 +4654,16 @@
           <w:sz w:val="28"/>
           <w:szCs w:val="28"/>
         </w:rPr>
-        <w:t>cgroup</w:t>
-      </w:r>
-      <w:proofErr w:type="spellEnd"/>
+        <w:t xml:space="preserve"> </w:t>
+      </w:r>
+      <w:r>
+        <w:rPr>
+          <w:rFonts w:asciiTheme="majorBidi" w:hAnsiTheme="majorBidi" w:cstheme="majorBidi"/>
+          <w:sz w:val="28"/>
+          <w:szCs w:val="28"/>
+        </w:rPr>
+        <w:t xml:space="preserve">→ </w:t>
+      </w:r>
       <w:r>
         <w:rPr>
           <w:rFonts w:asciiTheme="majorBidi" w:hAnsiTheme="majorBidi" w:cstheme="majorBidi"/>
@@ -4659,8 +4674,9 @@
           <w:sz w:val="28"/>
           <w:szCs w:val="28"/>
         </w:rPr>
-        <w:t xml:space="preserve"> driver</w:t>
-      </w:r>
+        <w:t>docker info | grep -</w:t>
+      </w:r>
+      <w:proofErr w:type="spellStart"/>
       <w:r>
         <w:rPr>
           <w:rFonts w:asciiTheme="majorBidi" w:hAnsiTheme="majorBidi" w:cstheme="majorBidi"/>
@@ -4671,8 +4687,9 @@
           <w:sz w:val="28"/>
           <w:szCs w:val="28"/>
         </w:rPr>
-        <w:t xml:space="preserve"> </w:t>
-      </w:r>
+        <w:t>i</w:t>
+      </w:r>
+      <w:proofErr w:type="spellEnd"/>
       <w:r>
         <w:rPr>
           <w:rFonts w:asciiTheme="majorBidi" w:hAnsiTheme="majorBidi" w:cstheme="majorBidi"/>
@@ -4683,7 +4700,7 @@
           <w:sz w:val="28"/>
           <w:szCs w:val="28"/>
         </w:rPr>
-        <w:t>docker info | grep -</w:t>
+        <w:t xml:space="preserve"> </w:t>
       </w:r>
       <w:proofErr w:type="spellStart"/>
       <w:r>
@@ -4696,10 +4713,14 @@
           <w:sz w:val="28"/>
           <w:szCs w:val="28"/>
         </w:rPr>
-        <w:t>i</w:t>
+        <w:t>cgroup</w:t>
       </w:r>
       <w:proofErr w:type="spellEnd"/>
-      <w:r>
+    </w:p>
+    <w:p>
+      <w:pPr>
+        <w:ind w:left="360"/>
+        <w:jc w:val="both"/>
         <w:rPr>
           <w:rFonts w:asciiTheme="majorBidi" w:hAnsiTheme="majorBidi" w:cstheme="majorBidi"/>
           <w:b/>
@@ -4709,6 +4730,21 @@
           <w:sz w:val="28"/>
           <w:szCs w:val="28"/>
         </w:rPr>
+      </w:pPr>
+      <w:r>
+        <w:rPr>
+          <w:rFonts w:asciiTheme="majorBidi" w:hAnsiTheme="majorBidi" w:cstheme="majorBidi"/>
+          <w:sz w:val="28"/>
+          <w:szCs w:val="28"/>
+        </w:rPr>
+        <w:t>If it already reports</w:t>
+      </w:r>
+      <w:r>
+        <w:rPr>
+          <w:rFonts w:asciiTheme="majorBidi" w:hAnsiTheme="majorBidi" w:cstheme="majorBidi"/>
+          <w:sz w:val="28"/>
+          <w:szCs w:val="28"/>
+        </w:rPr>
         <w:t xml:space="preserve"> </w:t>
       </w:r>
       <w:proofErr w:type="spellStart"/>
@@ -4722,13 +4758,10 @@
           <w:sz w:val="28"/>
           <w:szCs w:val="28"/>
         </w:rPr>
-        <w:t>cgroup</w:t>
+        <w:t>Cgroup</w:t>
       </w:r>
       <w:proofErr w:type="spellEnd"/>
-    </w:p>
-    <w:p>
-      <w:pPr>
-        <w:ind w:left="360"/>
+      <w:r>
         <w:rPr>
           <w:rFonts w:asciiTheme="majorBidi" w:hAnsiTheme="majorBidi" w:cstheme="majorBidi"/>
           <w:b/>
@@ -4738,24 +4771,8 @@
           <w:sz w:val="28"/>
           <w:szCs w:val="28"/>
         </w:rPr>
-      </w:pPr>
-      <w:r>
-        <w:rPr>
-          <w:rFonts w:asciiTheme="majorBidi" w:hAnsiTheme="majorBidi" w:cstheme="majorBidi"/>
-          <w:sz w:val="28"/>
-          <w:szCs w:val="28"/>
-        </w:rPr>
-        <w:t>If it already reports</w:t>
-      </w:r>
-      <w:r>
-        <w:rPr>
-          <w:rFonts w:asciiTheme="majorBidi" w:hAnsiTheme="majorBidi" w:cstheme="majorBidi"/>
-          <w:sz w:val="28"/>
-          <w:szCs w:val="28"/>
-        </w:rPr>
-        <w:t xml:space="preserve"> </w:t>
-      </w:r>
-      <w:proofErr w:type="spellStart"/>
+        <w:t xml:space="preserve"> Driver: </w:t>
+      </w:r>
       <w:r>
         <w:rPr>
           <w:rFonts w:asciiTheme="majorBidi" w:hAnsiTheme="majorBidi" w:cstheme="majorBidi"/>
@@ -4766,31 +4783,6 @@
           <w:sz w:val="28"/>
           <w:szCs w:val="28"/>
         </w:rPr>
-        <w:t>Cgroup</w:t>
-      </w:r>
-      <w:proofErr w:type="spellEnd"/>
-      <w:r>
-        <w:rPr>
-          <w:rFonts w:asciiTheme="majorBidi" w:hAnsiTheme="majorBidi" w:cstheme="majorBidi"/>
-          <w:b/>
-          <w:bCs/>
-          <w:i/>
-          <w:iCs/>
-          <w:sz w:val="28"/>
-          <w:szCs w:val="28"/>
-        </w:rPr>
-        <w:t xml:space="preserve"> Driver: </w:t>
-      </w:r>
-      <w:r>
-        <w:rPr>
-          <w:rFonts w:asciiTheme="majorBidi" w:hAnsiTheme="majorBidi" w:cstheme="majorBidi"/>
-          <w:b/>
-          <w:bCs/>
-          <w:i/>
-          <w:iCs/>
-          <w:sz w:val="28"/>
-          <w:szCs w:val="28"/>
-        </w:rPr>
         <w:t xml:space="preserve">system, </w:t>
       </w:r>
       <w:r>
@@ -4806,6 +4798,7 @@
       <w:pPr>
         <w:spacing w:after="80"/>
         <w:ind w:left="360"/>
+        <w:jc w:val="both"/>
         <w:rPr>
           <w:rFonts w:asciiTheme="majorBidi" w:hAnsiTheme="majorBidi" w:cstheme="majorBidi"/>
           <w:b/>
@@ -4822,9 +4815,8 @@
           <w:sz w:val="36"/>
           <w:szCs w:val="36"/>
         </w:rPr>
-        <w:t xml:space="preserve">why it should be the </w:t>
-      </w:r>
-      <w:proofErr w:type="spellStart"/>
+        <w:t>W</w:t>
+      </w:r>
       <w:r>
         <w:rPr>
           <w:rFonts w:asciiTheme="majorBidi" w:hAnsiTheme="majorBidi" w:cstheme="majorBidi"/>
@@ -4833,9 +4825,9 @@
           <w:sz w:val="36"/>
           <w:szCs w:val="36"/>
         </w:rPr>
-        <w:t>cgroup</w:t>
-      </w:r>
-      <w:proofErr w:type="spellEnd"/>
+        <w:t xml:space="preserve">hy it should be the </w:t>
+      </w:r>
+      <w:proofErr w:type="spellStart"/>
       <w:r>
         <w:rPr>
           <w:rFonts w:asciiTheme="majorBidi" w:hAnsiTheme="majorBidi" w:cstheme="majorBidi"/>
@@ -4844,9 +4836,9 @@
           <w:sz w:val="36"/>
           <w:szCs w:val="36"/>
         </w:rPr>
-        <w:t xml:space="preserve"> driver, </w:t>
-      </w:r>
-      <w:proofErr w:type="spellStart"/>
+        <w:t>cgroup</w:t>
+      </w:r>
+      <w:proofErr w:type="spellEnd"/>
       <w:r>
         <w:rPr>
           <w:rFonts w:asciiTheme="majorBidi" w:hAnsiTheme="majorBidi" w:cstheme="majorBidi"/>
@@ -4855,9 +4847,9 @@
           <w:sz w:val="36"/>
           <w:szCs w:val="36"/>
         </w:rPr>
-        <w:t>systemd</w:t>
-      </w:r>
-      <w:proofErr w:type="spellEnd"/>
+        <w:t xml:space="preserve"> driver, </w:t>
+      </w:r>
+      <w:proofErr w:type="spellStart"/>
       <w:r>
         <w:rPr>
           <w:rFonts w:asciiTheme="majorBidi" w:hAnsiTheme="majorBidi" w:cstheme="majorBidi"/>
@@ -4866,9 +4858,9 @@
           <w:sz w:val="36"/>
           <w:szCs w:val="36"/>
         </w:rPr>
-        <w:t xml:space="preserve"> and not </w:t>
-      </w:r>
-      <w:proofErr w:type="spellStart"/>
+        <w:t>systemd</w:t>
+      </w:r>
+      <w:proofErr w:type="spellEnd"/>
       <w:r>
         <w:rPr>
           <w:rFonts w:asciiTheme="majorBidi" w:hAnsiTheme="majorBidi" w:cstheme="majorBidi"/>
@@ -4877,9 +4869,9 @@
           <w:sz w:val="36"/>
           <w:szCs w:val="36"/>
         </w:rPr>
-        <w:t>cgroupfs</w:t>
-      </w:r>
-      <w:proofErr w:type="spellEnd"/>
+        <w:t xml:space="preserve"> and not </w:t>
+      </w:r>
+      <w:proofErr w:type="spellStart"/>
       <w:r>
         <w:rPr>
           <w:rFonts w:asciiTheme="majorBidi" w:hAnsiTheme="majorBidi" w:cstheme="majorBidi"/>
@@ -4888,6 +4880,17 @@
           <w:sz w:val="36"/>
           <w:szCs w:val="36"/>
         </w:rPr>
+        <w:t>cgroupfs</w:t>
+      </w:r>
+      <w:proofErr w:type="spellEnd"/>
+      <w:r>
+        <w:rPr>
+          <w:rFonts w:asciiTheme="majorBidi" w:hAnsiTheme="majorBidi" w:cstheme="majorBidi"/>
+          <w:b/>
+          <w:bCs/>
+          <w:sz w:val="36"/>
+          <w:szCs w:val="36"/>
+        </w:rPr>
         <w:t>?</w:t>
       </w:r>
     </w:p>
@@ -4895,6 +4898,7 @@
       <w:pPr>
         <w:spacing w:after="80"/>
         <w:ind w:left="360"/>
+        <w:jc w:val="both"/>
         <w:rPr>
           <w:rFonts w:asciiTheme="majorBidi" w:hAnsiTheme="majorBidi" w:cstheme="majorBidi"/>
           <w:sz w:val="28"/>
@@ -4913,6 +4917,7 @@
     <w:p>
       <w:pPr>
         <w:ind w:left="360"/>
+        <w:jc w:val="both"/>
         <w:rPr>
           <w:rFonts w:asciiTheme="majorBidi" w:hAnsiTheme="majorBidi" w:cstheme="majorBidi"/>
           <w:sz w:val="28"/>
@@ -5004,6 +5009,7 @@
       <w:pPr>
         <w:spacing w:after="80"/>
         <w:ind w:left="360"/>
+        <w:jc w:val="both"/>
         <w:rPr>
           <w:rFonts w:asciiTheme="majorBidi" w:hAnsiTheme="majorBidi" w:cstheme="majorBidi"/>
           <w:b/>
@@ -5049,6 +5055,7 @@
       <w:pPr>
         <w:spacing w:after="80"/>
         <w:ind w:left="360"/>
+        <w:jc w:val="both"/>
         <w:rPr>
           <w:rFonts w:asciiTheme="majorBidi" w:hAnsiTheme="majorBidi" w:cstheme="majorBidi"/>
           <w:sz w:val="28"/>
@@ -5068,6 +5075,7 @@
       <w:pPr>
         <w:spacing w:after="80"/>
         <w:ind w:left="360"/>
+        <w:jc w:val="both"/>
         <w:rPr>
           <w:rFonts w:asciiTheme="majorBidi" w:hAnsiTheme="majorBidi" w:cstheme="majorBidi"/>
           <w:sz w:val="28"/>
@@ -5178,6 +5186,7 @@
     <w:p>
       <w:pPr>
         <w:ind w:left="360"/>
+        <w:jc w:val="both"/>
         <w:rPr>
           <w:rFonts w:asciiTheme="majorBidi" w:hAnsiTheme="majorBidi" w:cstheme="majorBidi"/>
           <w:sz w:val="28"/>
@@ -5233,6 +5242,7 @@
       <w:pPr>
         <w:spacing w:after="80"/>
         <w:ind w:left="360"/>
+        <w:jc w:val="both"/>
         <w:rPr>
           <w:rFonts w:asciiTheme="majorBidi" w:hAnsiTheme="majorBidi" w:cstheme="majorBidi"/>
           <w:sz w:val="28"/>
@@ -5267,6 +5277,7 @@
         </w:numPr>
         <w:spacing w:after="60"/>
         <w:ind w:left="720"/>
+        <w:jc w:val="both"/>
         <w:rPr>
           <w:rFonts w:asciiTheme="majorBidi" w:hAnsiTheme="majorBidi" w:cstheme="majorBidi"/>
           <w:b/>
@@ -5292,6 +5303,7 @@
       <w:pPr>
         <w:spacing w:after="100"/>
         <w:ind w:left="720"/>
+        <w:jc w:val="both"/>
         <w:rPr>
           <w:rFonts w:asciiTheme="majorBidi" w:hAnsiTheme="majorBidi" w:cstheme="majorBidi"/>
           <w:sz w:val="28"/>
@@ -5373,6 +5385,7 @@
       <w:pPr>
         <w:spacing w:after="80"/>
         <w:ind w:left="720"/>
+        <w:jc w:val="both"/>
         <w:rPr>
           <w:rFonts w:asciiTheme="majorBidi" w:hAnsiTheme="majorBidi" w:cstheme="majorBidi"/>
           <w:sz w:val="28"/>
@@ -5394,6 +5407,7 @@
       <w:pPr>
         <w:spacing w:after="80"/>
         <w:ind w:left="720"/>
+        <w:jc w:val="both"/>
         <w:rPr>
           <w:rFonts w:asciiTheme="majorBidi" w:hAnsiTheme="majorBidi" w:cstheme="majorBidi"/>
           <w:b/>
@@ -5447,6 +5461,7 @@
       <w:pPr>
         <w:spacing w:after="80"/>
         <w:ind w:left="720"/>
+        <w:jc w:val="both"/>
         <w:rPr>
           <w:rFonts w:asciiTheme="majorBidi" w:hAnsiTheme="majorBidi" w:cstheme="majorBidi"/>
           <w:sz w:val="28"/>
@@ -5487,7 +5502,9 @@
           <w:ilvl w:val="0"/>
           <w:numId w:val="44"/>
         </w:numPr>
+        <w:spacing w:after="60"/>
         <w:ind w:left="720"/>
+        <w:jc w:val="both"/>
         <w:rPr>
           <w:rFonts w:asciiTheme="majorBidi" w:hAnsiTheme="majorBidi" w:cstheme="majorBidi"/>
           <w:b/>
@@ -5512,6 +5529,7 @@
     <w:p>
       <w:pPr>
         <w:ind w:left="720"/>
+        <w:jc w:val="both"/>
         <w:rPr>
           <w:rFonts w:asciiTheme="majorBidi" w:hAnsiTheme="majorBidi" w:cstheme="majorBidi"/>
           <w:sz w:val="28"/>
@@ -5982,6 +6000,7 @@
     <w:p>
       <w:pPr>
         <w:ind w:left="360"/>
+        <w:jc w:val="both"/>
         <w:rPr>
           <w:rFonts w:asciiTheme="majorBidi" w:hAnsiTheme="majorBidi" w:cstheme="majorBidi"/>
           <w:sz w:val="28"/>
@@ -5992,6 +6011,7 @@
     <w:p>
       <w:pPr>
         <w:ind w:left="360"/>
+        <w:jc w:val="both"/>
         <w:rPr>
           <w:rFonts w:asciiTheme="majorBidi" w:hAnsiTheme="majorBidi" w:cstheme="majorBidi"/>
           <w:sz w:val="28"/>
@@ -6002,6 +6022,7 @@
     <w:p>
       <w:pPr>
         <w:ind w:left="288"/>
+        <w:jc w:val="both"/>
         <w:rPr>
           <w:rFonts w:asciiTheme="majorBidi" w:hAnsiTheme="majorBidi" w:cstheme="majorBidi"/>
           <w:sz w:val="32"/>
@@ -6011,7 +6032,9 @@
     </w:p>
     <w:p>
       <w:pPr>
+        <w:spacing w:after="100"/>
         <w:ind w:left="720"/>
+        <w:jc w:val="both"/>
         <w:rPr>
           <w:rFonts w:asciiTheme="majorBidi" w:hAnsiTheme="majorBidi" w:cstheme="majorBidi"/>
           <w:sz w:val="28"/>
@@ -6043,6 +6066,52 @@
           <w:szCs w:val="28"/>
         </w:rPr>
         <w:t xml:space="preserve"> system.</w:t>
+      </w:r>
+    </w:p>
+    <w:p>
+      <w:pPr>
+        <w:spacing w:after="60"/>
+        <w:ind w:left="720"/>
+        <w:jc w:val="both"/>
+        <w:rPr>
+          <w:rFonts w:asciiTheme="majorBidi" w:hAnsiTheme="majorBidi" w:cstheme="majorBidi"/>
+          <w:b/>
+          <w:bCs/>
+          <w:sz w:val="28"/>
+          <w:szCs w:val="28"/>
+        </w:rPr>
+      </w:pPr>
+      <w:r>
+        <w:rPr>
+          <w:rFonts w:asciiTheme="majorBidi" w:hAnsiTheme="majorBidi" w:cstheme="majorBidi"/>
+          <w:b/>
+          <w:bCs/>
+          <w:sz w:val="28"/>
+          <w:szCs w:val="28"/>
+        </w:rPr>
+        <w:t xml:space="preserve">If </w:t>
+      </w:r>
+      <w:proofErr w:type="spellStart"/>
+      <w:r>
+        <w:rPr>
+          <w:rFonts w:asciiTheme="majorBidi" w:hAnsiTheme="majorBidi" w:cstheme="majorBidi"/>
+          <w:b/>
+          <w:bCs/>
+          <w:sz w:val="28"/>
+          <w:szCs w:val="28"/>
+        </w:rPr>
+        <w:t>kubelet</w:t>
+      </w:r>
+      <w:proofErr w:type="spellEnd"/>
+      <w:r>
+        <w:rPr>
+          <w:rFonts w:asciiTheme="majorBidi" w:hAnsiTheme="majorBidi" w:cstheme="majorBidi"/>
+          <w:b/>
+          <w:bCs/>
+          <w:sz w:val="28"/>
+          <w:szCs w:val="28"/>
+        </w:rPr>
+        <w:t xml:space="preserve"> asks docker to create containers, why they should match?</w:t>
       </w:r>
     </w:p>
     <w:p>
@@ -6052,28 +6121,50 @@
         <w:jc w:val="both"/>
         <w:rPr>
           <w:rFonts w:asciiTheme="majorBidi" w:hAnsiTheme="majorBidi" w:cstheme="majorBidi"/>
-          <w:b/>
-          <w:bCs/>
-          <w:sz w:val="28"/>
-          <w:szCs w:val="28"/>
-        </w:rPr>
-      </w:pPr>
-      <w:r>
-        <w:rPr>
-          <w:rFonts w:asciiTheme="majorBidi" w:hAnsiTheme="majorBidi" w:cstheme="majorBidi"/>
-          <w:b/>
-          <w:bCs/>
-          <w:sz w:val="28"/>
-          <w:szCs w:val="28"/>
-        </w:rPr>
-        <w:t xml:space="preserve">If </w:t>
-      </w:r>
+          <w:sz w:val="28"/>
+          <w:szCs w:val="28"/>
+        </w:rPr>
+      </w:pPr>
       <w:proofErr w:type="spellStart"/>
       <w:r>
         <w:rPr>
           <w:rFonts w:asciiTheme="majorBidi" w:hAnsiTheme="majorBidi" w:cstheme="majorBidi"/>
-          <w:b/>
-          <w:bCs/>
+          <w:sz w:val="28"/>
+          <w:szCs w:val="28"/>
+        </w:rPr>
+        <w:t>Kubelet</w:t>
+      </w:r>
+      <w:proofErr w:type="spellEnd"/>
+      <w:r>
+        <w:rPr>
+          <w:rFonts w:asciiTheme="majorBidi" w:hAnsiTheme="majorBidi" w:cstheme="majorBidi"/>
+          <w:sz w:val="28"/>
+          <w:szCs w:val="28"/>
+        </w:rPr>
+        <w:t xml:space="preserve"> does not do all resource-related work through Docker. Docker creates containers and puts them into </w:t>
+      </w:r>
+      <w:proofErr w:type="spellStart"/>
+      <w:r>
+        <w:rPr>
+          <w:rFonts w:asciiTheme="majorBidi" w:hAnsiTheme="majorBidi" w:cstheme="majorBidi"/>
+          <w:sz w:val="28"/>
+          <w:szCs w:val="28"/>
+        </w:rPr>
+        <w:t>cgroups</w:t>
+      </w:r>
+      <w:proofErr w:type="spellEnd"/>
+      <w:r>
+        <w:rPr>
+          <w:rFonts w:asciiTheme="majorBidi" w:hAnsiTheme="majorBidi" w:cstheme="majorBidi"/>
+          <w:sz w:val="28"/>
+          <w:szCs w:val="28"/>
+        </w:rPr>
+        <w:t xml:space="preserve">, but </w:t>
+      </w:r>
+      <w:proofErr w:type="spellStart"/>
+      <w:r>
+        <w:rPr>
+          <w:rFonts w:asciiTheme="majorBidi" w:hAnsiTheme="majorBidi" w:cstheme="majorBidi"/>
           <w:sz w:val="28"/>
           <w:szCs w:val="28"/>
         </w:rPr>
@@ -6083,12 +6174,100 @@
       <w:r>
         <w:rPr>
           <w:rFonts w:asciiTheme="majorBidi" w:hAnsiTheme="majorBidi" w:cstheme="majorBidi"/>
-          <w:b/>
-          <w:bCs/>
-          <w:sz w:val="28"/>
-          <w:szCs w:val="28"/>
-        </w:rPr>
-        <w:t xml:space="preserve"> asks docker to create containers, why they should match?</w:t>
+          <w:sz w:val="28"/>
+          <w:szCs w:val="28"/>
+        </w:rPr>
+        <w:t xml:space="preserve"> also reads and manages </w:t>
+      </w:r>
+      <w:proofErr w:type="spellStart"/>
+      <w:r>
+        <w:rPr>
+          <w:rFonts w:asciiTheme="majorBidi" w:hAnsiTheme="majorBidi" w:cstheme="majorBidi"/>
+          <w:sz w:val="28"/>
+          <w:szCs w:val="28"/>
+        </w:rPr>
+        <w:t>cgroups</w:t>
+      </w:r>
+      <w:proofErr w:type="spellEnd"/>
+      <w:r>
+        <w:rPr>
+          <w:rFonts w:asciiTheme="majorBidi" w:hAnsiTheme="majorBidi" w:cstheme="majorBidi"/>
+          <w:sz w:val="28"/>
+          <w:szCs w:val="28"/>
+        </w:rPr>
+        <w:t xml:space="preserve"> itself for Kubernetes resource control. If Docker and </w:t>
+      </w:r>
+      <w:proofErr w:type="spellStart"/>
+      <w:r>
+        <w:rPr>
+          <w:rFonts w:asciiTheme="majorBidi" w:hAnsiTheme="majorBidi" w:cstheme="majorBidi"/>
+          <w:sz w:val="28"/>
+          <w:szCs w:val="28"/>
+        </w:rPr>
+        <w:t>kubelet</w:t>
+      </w:r>
+      <w:proofErr w:type="spellEnd"/>
+      <w:r>
+        <w:rPr>
+          <w:rFonts w:asciiTheme="majorBidi" w:hAnsiTheme="majorBidi" w:cstheme="majorBidi"/>
+          <w:sz w:val="28"/>
+          <w:szCs w:val="28"/>
+        </w:rPr>
+        <w:t xml:space="preserve"> use different </w:t>
+      </w:r>
+      <w:proofErr w:type="spellStart"/>
+      <w:r>
+        <w:rPr>
+          <w:rFonts w:asciiTheme="majorBidi" w:hAnsiTheme="majorBidi" w:cstheme="majorBidi"/>
+          <w:sz w:val="28"/>
+          <w:szCs w:val="28"/>
+        </w:rPr>
+        <w:t>cgroup</w:t>
+      </w:r>
+      <w:proofErr w:type="spellEnd"/>
+      <w:r>
+        <w:rPr>
+          <w:rFonts w:asciiTheme="majorBidi" w:hAnsiTheme="majorBidi" w:cstheme="majorBidi"/>
+          <w:sz w:val="28"/>
+          <w:szCs w:val="28"/>
+        </w:rPr>
+        <w:t xml:space="preserve"> drivers, they may use different </w:t>
+      </w:r>
+      <w:proofErr w:type="spellStart"/>
+      <w:r>
+        <w:rPr>
+          <w:rFonts w:asciiTheme="majorBidi" w:hAnsiTheme="majorBidi" w:cstheme="majorBidi"/>
+          <w:sz w:val="28"/>
+          <w:szCs w:val="28"/>
+        </w:rPr>
+        <w:t>cgroup</w:t>
+      </w:r>
+      <w:proofErr w:type="spellEnd"/>
+      <w:r>
+        <w:rPr>
+          <w:rFonts w:asciiTheme="majorBidi" w:hAnsiTheme="majorBidi" w:cstheme="majorBidi"/>
+          <w:sz w:val="28"/>
+          <w:szCs w:val="28"/>
+        </w:rPr>
+        <w:t xml:space="preserve"> layouts, so </w:t>
+      </w:r>
+      <w:proofErr w:type="spellStart"/>
+      <w:r>
+        <w:rPr>
+          <w:rFonts w:asciiTheme="majorBidi" w:hAnsiTheme="majorBidi" w:cstheme="majorBidi"/>
+          <w:sz w:val="28"/>
+          <w:szCs w:val="28"/>
+        </w:rPr>
+        <w:t>kubelet</w:t>
+      </w:r>
+      <w:proofErr w:type="spellEnd"/>
+      <w:r>
+        <w:rPr>
+          <w:rFonts w:asciiTheme="majorBidi" w:hAnsiTheme="majorBidi" w:cstheme="majorBidi"/>
+          <w:sz w:val="28"/>
+          <w:szCs w:val="28"/>
+        </w:rPr>
+        <w:t xml:space="preserve"> may not correctly find, monitor, or manage the containers that Docker created.</w:t>
       </w:r>
     </w:p>
     <w:p>
@@ -6098,196 +6277,40 @@
         <w:jc w:val="both"/>
         <w:rPr>
           <w:rFonts w:asciiTheme="majorBidi" w:hAnsiTheme="majorBidi" w:cstheme="majorBidi"/>
-          <w:sz w:val="28"/>
-          <w:szCs w:val="28"/>
-        </w:rPr>
-      </w:pPr>
-      <w:proofErr w:type="spellStart"/>
-      <w:r>
-        <w:rPr>
-          <w:rFonts w:asciiTheme="majorBidi" w:hAnsiTheme="majorBidi" w:cstheme="majorBidi"/>
-          <w:sz w:val="28"/>
-          <w:szCs w:val="28"/>
-        </w:rPr>
-        <w:t>Kubelet</w:t>
-      </w:r>
-      <w:proofErr w:type="spellEnd"/>
-      <w:r>
-        <w:rPr>
-          <w:rFonts w:asciiTheme="majorBidi" w:hAnsiTheme="majorBidi" w:cstheme="majorBidi"/>
-          <w:sz w:val="28"/>
-          <w:szCs w:val="28"/>
-        </w:rPr>
-        <w:t xml:space="preserve"> does not do all resource-related work through Docker. Docker creates containers and puts them into </w:t>
-      </w:r>
-      <w:proofErr w:type="spellStart"/>
-      <w:r>
-        <w:rPr>
-          <w:rFonts w:asciiTheme="majorBidi" w:hAnsiTheme="majorBidi" w:cstheme="majorBidi"/>
-          <w:sz w:val="28"/>
-          <w:szCs w:val="28"/>
-        </w:rPr>
-        <w:t>cgroups</w:t>
-      </w:r>
-      <w:proofErr w:type="spellEnd"/>
-      <w:r>
-        <w:rPr>
-          <w:rFonts w:asciiTheme="majorBidi" w:hAnsiTheme="majorBidi" w:cstheme="majorBidi"/>
-          <w:sz w:val="28"/>
-          <w:szCs w:val="28"/>
-        </w:rPr>
-        <w:t xml:space="preserve">, but </w:t>
-      </w:r>
-      <w:proofErr w:type="spellStart"/>
-      <w:r>
-        <w:rPr>
-          <w:rFonts w:asciiTheme="majorBidi" w:hAnsiTheme="majorBidi" w:cstheme="majorBidi"/>
-          <w:sz w:val="28"/>
-          <w:szCs w:val="28"/>
-        </w:rPr>
-        <w:t>kubelet</w:t>
-      </w:r>
-      <w:proofErr w:type="spellEnd"/>
-      <w:r>
-        <w:rPr>
-          <w:rFonts w:asciiTheme="majorBidi" w:hAnsiTheme="majorBidi" w:cstheme="majorBidi"/>
-          <w:sz w:val="28"/>
-          <w:szCs w:val="28"/>
-        </w:rPr>
-        <w:t xml:space="preserve"> also reads and manages </w:t>
-      </w:r>
-      <w:proofErr w:type="spellStart"/>
-      <w:r>
-        <w:rPr>
-          <w:rFonts w:asciiTheme="majorBidi" w:hAnsiTheme="majorBidi" w:cstheme="majorBidi"/>
-          <w:sz w:val="28"/>
-          <w:szCs w:val="28"/>
-        </w:rPr>
-        <w:t>cgroups</w:t>
-      </w:r>
-      <w:proofErr w:type="spellEnd"/>
-      <w:r>
-        <w:rPr>
-          <w:rFonts w:asciiTheme="majorBidi" w:hAnsiTheme="majorBidi" w:cstheme="majorBidi"/>
-          <w:sz w:val="28"/>
-          <w:szCs w:val="28"/>
-        </w:rPr>
-        <w:t xml:space="preserve"> itself for Kubernetes resource control. If Docker and </w:t>
-      </w:r>
-      <w:proofErr w:type="spellStart"/>
-      <w:r>
-        <w:rPr>
-          <w:rFonts w:asciiTheme="majorBidi" w:hAnsiTheme="majorBidi" w:cstheme="majorBidi"/>
-          <w:sz w:val="28"/>
-          <w:szCs w:val="28"/>
-        </w:rPr>
-        <w:t>kubelet</w:t>
-      </w:r>
-      <w:proofErr w:type="spellEnd"/>
-      <w:r>
-        <w:rPr>
-          <w:rFonts w:asciiTheme="majorBidi" w:hAnsiTheme="majorBidi" w:cstheme="majorBidi"/>
-          <w:sz w:val="28"/>
-          <w:szCs w:val="28"/>
-        </w:rPr>
-        <w:t xml:space="preserve"> use different </w:t>
-      </w:r>
-      <w:proofErr w:type="spellStart"/>
-      <w:r>
-        <w:rPr>
-          <w:rFonts w:asciiTheme="majorBidi" w:hAnsiTheme="majorBidi" w:cstheme="majorBidi"/>
-          <w:sz w:val="28"/>
-          <w:szCs w:val="28"/>
-        </w:rPr>
-        <w:t>cgroup</w:t>
-      </w:r>
-      <w:proofErr w:type="spellEnd"/>
-      <w:r>
-        <w:rPr>
-          <w:rFonts w:asciiTheme="majorBidi" w:hAnsiTheme="majorBidi" w:cstheme="majorBidi"/>
-          <w:sz w:val="28"/>
-          <w:szCs w:val="28"/>
-        </w:rPr>
-        <w:t xml:space="preserve"> drivers, they may use different </w:t>
-      </w:r>
-      <w:proofErr w:type="spellStart"/>
-      <w:r>
-        <w:rPr>
-          <w:rFonts w:asciiTheme="majorBidi" w:hAnsiTheme="majorBidi" w:cstheme="majorBidi"/>
-          <w:sz w:val="28"/>
-          <w:szCs w:val="28"/>
-        </w:rPr>
-        <w:t>cgroup</w:t>
-      </w:r>
-      <w:proofErr w:type="spellEnd"/>
-      <w:r>
-        <w:rPr>
-          <w:rFonts w:asciiTheme="majorBidi" w:hAnsiTheme="majorBidi" w:cstheme="majorBidi"/>
-          <w:sz w:val="28"/>
-          <w:szCs w:val="28"/>
-        </w:rPr>
-        <w:t xml:space="preserve"> layouts, so </w:t>
-      </w:r>
-      <w:proofErr w:type="spellStart"/>
-      <w:r>
-        <w:rPr>
-          <w:rFonts w:asciiTheme="majorBidi" w:hAnsiTheme="majorBidi" w:cstheme="majorBidi"/>
-          <w:sz w:val="28"/>
-          <w:szCs w:val="28"/>
-        </w:rPr>
-        <w:t>kubelet</w:t>
-      </w:r>
-      <w:proofErr w:type="spellEnd"/>
-      <w:r>
-        <w:rPr>
-          <w:rFonts w:asciiTheme="majorBidi" w:hAnsiTheme="majorBidi" w:cstheme="majorBidi"/>
-          <w:sz w:val="28"/>
-          <w:szCs w:val="28"/>
-        </w:rPr>
-        <w:t xml:space="preserve"> may not correctly find, monitor, or manage the containers that Docker created.</w:t>
-      </w:r>
-    </w:p>
-    <w:p>
-      <w:pPr>
-        <w:spacing w:after="80"/>
+          <w:b/>
+          <w:bCs/>
+          <w:sz w:val="28"/>
+          <w:szCs w:val="28"/>
+        </w:rPr>
+      </w:pPr>
+      <w:r>
+        <w:rPr>
+          <w:rFonts w:asciiTheme="majorBidi" w:hAnsiTheme="majorBidi" w:cstheme="majorBidi"/>
+          <w:b/>
+          <w:bCs/>
+          <w:sz w:val="28"/>
+          <w:szCs w:val="28"/>
+        </w:rPr>
+        <w:t>Shorter version:</w:t>
+      </w:r>
+    </w:p>
+    <w:p>
+      <w:pPr>
         <w:ind w:left="720"/>
         <w:jc w:val="both"/>
         <w:rPr>
           <w:rFonts w:asciiTheme="majorBidi" w:hAnsiTheme="majorBidi" w:cstheme="majorBidi"/>
-          <w:b/>
-          <w:bCs/>
-          <w:sz w:val="28"/>
-          <w:szCs w:val="28"/>
-        </w:rPr>
-      </w:pPr>
-      <w:r>
-        <w:rPr>
-          <w:rFonts w:asciiTheme="majorBidi" w:hAnsiTheme="majorBidi" w:cstheme="majorBidi"/>
-          <w:b/>
-          <w:bCs/>
+          <w:sz w:val="28"/>
+          <w:szCs w:val="28"/>
+        </w:rPr>
+      </w:pPr>
+      <w:r>
+        <w:rPr>
+          <w:rFonts w:asciiTheme="majorBidi" w:hAnsiTheme="majorBidi" w:cstheme="majorBidi"/>
           <w:sz w:val="28"/>
           <w:szCs w:val="28"/>
         </w:rPr>
         <w:lastRenderedPageBreak/>
-        <w:t>Shorter version:</w:t>
-      </w:r>
-    </w:p>
-    <w:p>
-      <w:pPr>
-        <w:ind w:left="720"/>
-        <w:jc w:val="both"/>
-        <w:rPr>
-          <w:rFonts w:asciiTheme="majorBidi" w:hAnsiTheme="majorBidi" w:cstheme="majorBidi"/>
-          <w:sz w:val="28"/>
-          <w:szCs w:val="28"/>
-        </w:rPr>
-      </w:pPr>
-      <w:r>
-        <w:rPr>
-          <w:rFonts w:asciiTheme="majorBidi" w:hAnsiTheme="majorBidi" w:cstheme="majorBidi"/>
-          <w:sz w:val="28"/>
-          <w:szCs w:val="28"/>
-        </w:rPr>
         <w:t xml:space="preserve">Docker creates the container </w:t>
       </w:r>
       <w:proofErr w:type="spellStart"/>
@@ -6389,7 +6412,8 @@
           <w:numId w:val="45"/>
         </w:numPr>
         <w:spacing w:after="80"/>
-        <w:ind w:left="1080"/>
+        <w:ind w:left="720"/>
+        <w:jc w:val="both"/>
         <w:rPr>
           <w:rFonts w:asciiTheme="majorBidi" w:hAnsiTheme="majorBidi" w:cstheme="majorBidi"/>
           <w:sz w:val="28"/>
@@ -6424,7 +6448,8 @@
     <w:p>
       <w:pPr>
         <w:spacing w:after="80"/>
-        <w:ind w:left="1080"/>
+        <w:ind w:left="720"/>
+        <w:jc w:val="both"/>
         <w:rPr>
           <w:rFonts w:asciiTheme="majorBidi" w:hAnsiTheme="majorBidi" w:cstheme="majorBidi"/>
           <w:sz w:val="28"/>
@@ -6478,7 +6503,7 @@
     </w:p>
     <w:p>
       <w:pPr>
-        <w:ind w:left="1080"/>
+        <w:ind w:left="720"/>
         <w:jc w:val="both"/>
         <w:rPr>
           <w:rFonts w:asciiTheme="majorBidi" w:hAnsiTheme="majorBidi" w:cstheme="majorBidi"/>
@@ -6550,6 +6575,7 @@
         </w:numPr>
         <w:spacing w:after="80"/>
         <w:ind w:left="360"/>
+        <w:jc w:val="both"/>
         <w:rPr>
           <w:rFonts w:asciiTheme="majorBidi" w:hAnsiTheme="majorBidi" w:cstheme="majorBidi"/>
           <w:b/>
@@ -6572,6 +6598,7 @@
     <w:p>
       <w:pPr>
         <w:ind w:left="360"/>
+        <w:jc w:val="both"/>
         <w:rPr>
           <w:rFonts w:asciiTheme="majorBidi" w:hAnsiTheme="majorBidi" w:cstheme="majorBidi"/>
           <w:sz w:val="28"/>
@@ -6978,6 +7005,7 @@
     <w:p>
       <w:pPr>
         <w:ind w:left="360"/>
+        <w:jc w:val="both"/>
         <w:rPr>
           <w:rFonts w:asciiTheme="majorBidi" w:hAnsiTheme="majorBidi" w:cstheme="majorBidi"/>
           <w:sz w:val="28"/>
@@ -6988,6 +7016,7 @@
     <w:p>
       <w:pPr>
         <w:ind w:left="360"/>
+        <w:jc w:val="both"/>
         <w:rPr>
           <w:rFonts w:asciiTheme="majorBidi" w:hAnsiTheme="majorBidi" w:cstheme="majorBidi"/>
           <w:sz w:val="16"/>
@@ -6998,6 +7027,7 @@
     <w:p>
       <w:pPr>
         <w:ind w:left="360"/>
+        <w:jc w:val="both"/>
         <w:rPr>
           <w:rFonts w:asciiTheme="majorBidi" w:hAnsiTheme="majorBidi" w:cstheme="majorBidi"/>
           <w:sz w:val="28"/>
@@ -7302,6 +7332,7 @@
     <w:p>
       <w:pPr>
         <w:ind w:left="360"/>
+        <w:jc w:val="both"/>
         <w:rPr>
           <w:rFonts w:asciiTheme="majorBidi" w:hAnsiTheme="majorBidi" w:cstheme="majorBidi"/>
           <w:sz w:val="28"/>
@@ -7312,6 +7343,7 @@
     <w:p>
       <w:pPr>
         <w:ind w:left="360"/>
+        <w:jc w:val="both"/>
         <w:rPr>
           <w:rFonts w:asciiTheme="majorBidi" w:hAnsiTheme="majorBidi" w:cstheme="majorBidi"/>
           <w:sz w:val="18"/>
@@ -7328,6 +7360,7 @@
         </w:numPr>
         <w:spacing w:after="80"/>
         <w:ind w:left="720"/>
+        <w:jc w:val="both"/>
         <w:rPr>
           <w:rFonts w:asciiTheme="majorBidi" w:hAnsiTheme="majorBidi" w:cstheme="majorBidi"/>
           <w:b/>
@@ -7636,6 +7669,7 @@
         </w:numPr>
         <w:spacing w:after="80"/>
         <w:ind w:left="720"/>
+        <w:jc w:val="both"/>
         <w:rPr>
           <w:rFonts w:asciiTheme="majorBidi" w:hAnsiTheme="majorBidi" w:cstheme="majorBidi"/>
           <w:b/>
@@ -7818,6 +7852,8 @@
       <w:r>
         <w:rPr>
           <w:rFonts w:asciiTheme="majorBidi" w:hAnsiTheme="majorBidi" w:cstheme="majorBidi"/>
+          <w:b/>
+          <w:bCs/>
           <w:sz w:val="28"/>
           <w:szCs w:val="28"/>
         </w:rPr>
@@ -8039,6 +8075,7 @@
     <w:p>
       <w:pPr>
         <w:ind w:left="720"/>
+        <w:jc w:val="both"/>
         <w:rPr>
           <w:rFonts w:asciiTheme="majorBidi" w:hAnsiTheme="majorBidi" w:cstheme="majorBidi"/>
           <w:sz w:val="28"/>
@@ -8049,6 +8086,7 @@
     <w:p>
       <w:pPr>
         <w:ind w:left="720"/>
+        <w:jc w:val="both"/>
         <w:rPr>
           <w:rFonts w:asciiTheme="majorBidi" w:hAnsiTheme="majorBidi" w:cstheme="majorBidi"/>
           <w:sz w:val="18"/>
@@ -8060,6 +8098,7 @@
       <w:pPr>
         <w:spacing w:after="80"/>
         <w:ind w:left="720"/>
+        <w:jc w:val="both"/>
         <w:rPr>
           <w:rFonts w:asciiTheme="majorBidi" w:hAnsiTheme="majorBidi" w:cstheme="majorBidi"/>
           <w:sz w:val="28"/>
@@ -8096,6 +8135,7 @@
     <w:p>
       <w:pPr>
         <w:ind w:left="720"/>
+        <w:jc w:val="both"/>
         <w:rPr>
           <w:rFonts w:asciiTheme="majorBidi" w:hAnsiTheme="majorBidi" w:cstheme="majorBidi"/>
           <w:sz w:val="28"/>
@@ -8224,7 +8264,23 @@
           <w:szCs w:val="28"/>
         </w:rPr>
         <w:lastRenderedPageBreak/>
-        <w:t xml:space="preserve">This is essential because Kubernetes implements many networking features—such as Services, </w:t>
+        <w:t>This is essential because Kubernetes implements many networking features</w:t>
+      </w:r>
+      <w:r>
+        <w:rPr>
+          <w:rFonts w:asciiTheme="majorBidi" w:hAnsiTheme="majorBidi" w:cstheme="majorBidi"/>
+          <w:sz w:val="28"/>
+          <w:szCs w:val="28"/>
+        </w:rPr>
+        <w:t xml:space="preserve"> - </w:t>
+      </w:r>
+      <w:r>
+        <w:rPr>
+          <w:rFonts w:asciiTheme="majorBidi" w:hAnsiTheme="majorBidi" w:cstheme="majorBidi"/>
+          <w:sz w:val="28"/>
+          <w:szCs w:val="28"/>
+        </w:rPr>
+        <w:t xml:space="preserve">such as Services, </w:t>
       </w:r>
       <w:proofErr w:type="spellStart"/>
       <w:r>
@@ -8269,6 +8325,7 @@
           <w:numId w:val="18"/>
         </w:numPr>
         <w:ind w:left="360"/>
+        <w:jc w:val="both"/>
         <w:rPr>
           <w:rFonts w:asciiTheme="majorBidi" w:hAnsiTheme="majorBidi" w:cstheme="majorBidi"/>
           <w:b/>
@@ -8308,35 +8365,20 @@
           <w:numId w:val="47"/>
         </w:numPr>
         <w:ind w:left="720"/>
-        <w:rPr>
-          <w:rFonts w:asciiTheme="majorBidi" w:hAnsiTheme="majorBidi" w:cstheme="majorBidi"/>
-          <w:sz w:val="28"/>
-          <w:szCs w:val="28"/>
-        </w:rPr>
-      </w:pPr>
-      <w:r>
-        <w:rPr>
-          <w:rFonts w:asciiTheme="majorBidi" w:hAnsiTheme="majorBidi" w:cstheme="majorBidi"/>
-          <w:sz w:val="28"/>
-          <w:szCs w:val="28"/>
-        </w:rPr>
-        <w:t>Create</w:t>
-      </w:r>
-      <w:r>
-        <w:rPr>
-          <w:rFonts w:asciiTheme="majorBidi" w:hAnsiTheme="majorBidi" w:cstheme="majorBidi"/>
-          <w:sz w:val="28"/>
-          <w:szCs w:val="28"/>
-        </w:rPr>
-        <w:t xml:space="preserve"> </w:t>
-      </w:r>
-      <w:r>
-        <w:rPr>
-          <w:rFonts w:asciiTheme="majorBidi" w:hAnsiTheme="majorBidi" w:cstheme="majorBidi"/>
-          <w:sz w:val="28"/>
-          <w:szCs w:val="28"/>
-        </w:rPr>
-        <w:t xml:space="preserve">→ </w:t>
+        <w:jc w:val="both"/>
+        <w:rPr>
+          <w:rFonts w:asciiTheme="majorBidi" w:hAnsiTheme="majorBidi" w:cstheme="majorBidi"/>
+          <w:sz w:val="28"/>
+          <w:szCs w:val="28"/>
+        </w:rPr>
+      </w:pPr>
+      <w:r>
+        <w:rPr>
+          <w:rFonts w:asciiTheme="majorBidi" w:hAnsiTheme="majorBidi" w:cstheme="majorBidi"/>
+          <w:sz w:val="28"/>
+          <w:szCs w:val="28"/>
+        </w:rPr>
+        <w:t xml:space="preserve">Create → </w:t>
       </w:r>
       <w:proofErr w:type="spellStart"/>
       <w:r>
@@ -8425,6 +8467,7 @@
           <w:numId w:val="47"/>
         </w:numPr>
         <w:ind w:left="720"/>
+        <w:jc w:val="both"/>
         <w:rPr>
           <w:rFonts w:asciiTheme="majorBidi" w:hAnsiTheme="majorBidi" w:cstheme="majorBidi"/>
           <w:sz w:val="28"/>
@@ -8448,6 +8491,7 @@
           <w:numId w:val="48"/>
         </w:numPr>
         <w:ind w:left="1080"/>
+        <w:jc w:val="both"/>
         <w:rPr>
           <w:rFonts w:asciiTheme="majorBidi" w:hAnsiTheme="majorBidi" w:cstheme="majorBidi"/>
           <w:b/>
@@ -8533,6 +8577,7 @@
           <w:numId w:val="48"/>
         </w:numPr>
         <w:ind w:left="1080"/>
+        <w:jc w:val="both"/>
         <w:rPr>
           <w:rFonts w:asciiTheme="majorBidi" w:hAnsiTheme="majorBidi" w:cstheme="majorBidi"/>
           <w:b/>
@@ -8578,6 +8623,7 @@
           <w:numId w:val="48"/>
         </w:numPr>
         <w:ind w:left="1080"/>
+        <w:jc w:val="both"/>
         <w:rPr>
           <w:rFonts w:asciiTheme="majorBidi" w:hAnsiTheme="majorBidi" w:cstheme="majorBidi"/>
           <w:b/>
@@ -8623,6 +8669,7 @@
           <w:numId w:val="49"/>
         </w:numPr>
         <w:ind w:left="720"/>
+        <w:jc w:val="both"/>
         <w:rPr>
           <w:rFonts w:asciiTheme="majorBidi" w:hAnsiTheme="majorBidi" w:cstheme="majorBidi"/>
           <w:sz w:val="28"/>
@@ -8714,6 +8761,7 @@
           <w:numId w:val="49"/>
         </w:numPr>
         <w:ind w:left="720"/>
+        <w:jc w:val="both"/>
         <w:rPr>
           <w:rFonts w:asciiTheme="majorBidi" w:hAnsiTheme="majorBidi" w:cstheme="majorBidi"/>
           <w:sz w:val="28"/>
@@ -8863,6 +8911,7 @@
       <w:pPr>
         <w:spacing w:after="80"/>
         <w:ind w:left="360"/>
+        <w:jc w:val="both"/>
         <w:rPr>
           <w:rFonts w:asciiTheme="majorBidi" w:hAnsiTheme="majorBidi" w:cstheme="majorBidi"/>
           <w:b/>
@@ -8907,6 +8956,7 @@
     <w:p>
       <w:pPr>
         <w:ind w:left="360"/>
+        <w:jc w:val="both"/>
         <w:rPr>
           <w:rFonts w:asciiTheme="majorBidi" w:hAnsiTheme="majorBidi" w:cstheme="majorBidi"/>
           <w:sz w:val="28"/>
@@ -9343,24 +9393,27 @@
     <w:p>
       <w:pPr>
         <w:ind w:left="720"/>
-        <w:rPr>
-          <w:rFonts w:asciiTheme="majorBidi" w:hAnsiTheme="majorBidi" w:cstheme="majorBidi"/>
-          <w:sz w:val="28"/>
-          <w:szCs w:val="28"/>
-        </w:rPr>
-      </w:pPr>
-    </w:p>
-    <w:p>
-      <w:pPr>
-        <w:rPr>
-          <w:rFonts w:asciiTheme="majorBidi" w:hAnsiTheme="majorBidi" w:cstheme="majorBidi"/>
-          <w:sz w:val="28"/>
-          <w:szCs w:val="28"/>
-        </w:rPr>
-      </w:pPr>
-    </w:p>
-    <w:p>
-      <w:pPr>
+        <w:jc w:val="both"/>
+        <w:rPr>
+          <w:rFonts w:asciiTheme="majorBidi" w:hAnsiTheme="majorBidi" w:cstheme="majorBidi"/>
+          <w:sz w:val="28"/>
+          <w:szCs w:val="28"/>
+        </w:rPr>
+      </w:pPr>
+    </w:p>
+    <w:p>
+      <w:pPr>
+        <w:jc w:val="both"/>
+        <w:rPr>
+          <w:rFonts w:asciiTheme="majorBidi" w:hAnsiTheme="majorBidi" w:cstheme="majorBidi"/>
+          <w:sz w:val="28"/>
+          <w:szCs w:val="28"/>
+        </w:rPr>
+      </w:pPr>
+    </w:p>
+    <w:p>
+      <w:pPr>
+        <w:jc w:val="both"/>
         <w:rPr>
           <w:rFonts w:asciiTheme="majorBidi" w:hAnsiTheme="majorBidi" w:cstheme="majorBidi"/>
           <w:sz w:val="10"/>
@@ -9372,6 +9425,7 @@
       <w:pPr>
         <w:spacing w:after="80"/>
         <w:ind w:left="360"/>
+        <w:jc w:val="both"/>
         <w:rPr>
           <w:rFonts w:asciiTheme="majorBidi" w:hAnsiTheme="majorBidi" w:cstheme="majorBidi"/>
           <w:sz w:val="28"/>
@@ -9395,6 +9449,7 @@
           <w:numId w:val="50"/>
         </w:numPr>
         <w:ind w:left="720"/>
+        <w:jc w:val="both"/>
         <w:rPr>
           <w:rFonts w:asciiTheme="majorBidi" w:hAnsiTheme="majorBidi" w:cstheme="majorBidi"/>
           <w:sz w:val="28"/>
@@ -9445,15 +9500,7 @@
           <w:sz w:val="28"/>
           <w:szCs w:val="28"/>
         </w:rPr>
-        <w:t xml:space="preserve"> </w:t>
-      </w:r>
-      <w:r>
-        <w:rPr>
-          <w:rFonts w:asciiTheme="majorBidi" w:hAnsiTheme="majorBidi" w:cstheme="majorBidi"/>
-          <w:sz w:val="28"/>
-          <w:szCs w:val="28"/>
-        </w:rPr>
-        <w:t>→ Apply IPv4 firewall rules to packets crossing a Linux bridge.</w:t>
+        <w:t xml:space="preserve"> → Apply IPv4 firewall rules to packets crossing a Linux bridge.</w:t>
       </w:r>
     </w:p>
     <w:p>
@@ -9464,6 +9511,7 @@
           <w:numId w:val="50"/>
         </w:numPr>
         <w:ind w:left="720"/>
+        <w:jc w:val="both"/>
         <w:rPr>
           <w:rFonts w:asciiTheme="majorBidi" w:hAnsiTheme="majorBidi" w:cstheme="majorBidi"/>
           <w:sz w:val="28"/>
@@ -9499,6 +9547,7 @@
           <w:numId w:val="50"/>
         </w:numPr>
         <w:ind w:left="720"/>
+        <w:jc w:val="both"/>
         <w:rPr>
           <w:rFonts w:asciiTheme="majorBidi" w:hAnsiTheme="majorBidi" w:cstheme="majorBidi"/>
           <w:sz w:val="28"/>
@@ -9544,6 +9593,7 @@
       <w:pPr>
         <w:spacing w:after="80"/>
         <w:ind w:left="360"/>
+        <w:jc w:val="both"/>
         <w:rPr>
           <w:rFonts w:asciiTheme="majorBidi" w:hAnsiTheme="majorBidi" w:cstheme="majorBidi"/>
           <w:b/>
@@ -9567,6 +9617,7 @@
       <w:pPr>
         <w:spacing w:after="80"/>
         <w:ind w:left="360"/>
+        <w:jc w:val="both"/>
         <w:rPr>
           <w:rFonts w:asciiTheme="majorBidi" w:hAnsiTheme="majorBidi" w:cstheme="majorBidi"/>
           <w:sz w:val="28"/>
@@ -11376,6 +11427,7 @@
       <w:pPr>
         <w:spacing w:after="80"/>
         <w:ind w:left="360"/>
+        <w:jc w:val="both"/>
         <w:rPr>
           <w:rFonts w:asciiTheme="majorBidi" w:hAnsiTheme="majorBidi" w:cstheme="majorBidi"/>
           <w:sz w:val="28"/>
@@ -11411,6 +11463,7 @@
       <w:pPr>
         <w:spacing w:after="80"/>
         <w:ind w:left="360"/>
+        <w:jc w:val="both"/>
         <w:rPr>
           <w:rFonts w:asciiTheme="majorBidi" w:hAnsiTheme="majorBidi" w:cstheme="majorBidi"/>
           <w:b/>
@@ -11566,6 +11619,7 @@
       <w:pPr>
         <w:spacing w:after="80"/>
         <w:ind w:left="360"/>
+        <w:jc w:val="both"/>
         <w:rPr>
           <w:rFonts w:asciiTheme="majorBidi" w:hAnsiTheme="majorBidi" w:cstheme="majorBidi"/>
           <w:sz w:val="28"/>
@@ -11585,24 +11639,41 @@
       <w:pPr>
         <w:spacing w:after="80"/>
         <w:ind w:left="360"/>
-        <w:rPr>
-          <w:rFonts w:asciiTheme="majorBidi" w:hAnsiTheme="majorBidi" w:cstheme="majorBidi"/>
-          <w:sz w:val="28"/>
-          <w:szCs w:val="28"/>
-        </w:rPr>
-      </w:pPr>
-      <w:r>
-        <w:rPr>
-          <w:rFonts w:asciiTheme="majorBidi" w:hAnsiTheme="majorBidi" w:cstheme="majorBidi"/>
-          <w:sz w:val="28"/>
-          <w:szCs w:val="28"/>
-        </w:rPr>
-        <w:t>Unlike RKE2, where each node has its own /</w:t>
+        <w:jc w:val="both"/>
+        <w:rPr>
+          <w:rFonts w:asciiTheme="majorBidi" w:hAnsiTheme="majorBidi" w:cstheme="majorBidi"/>
+          <w:sz w:val="28"/>
+          <w:szCs w:val="28"/>
+        </w:rPr>
+      </w:pPr>
+      <w:r>
+        <w:rPr>
+          <w:rFonts w:asciiTheme="majorBidi" w:hAnsiTheme="majorBidi" w:cstheme="majorBidi"/>
+          <w:sz w:val="28"/>
+          <w:szCs w:val="28"/>
+        </w:rPr>
+        <w:t xml:space="preserve">Unlike RKE2, where each node has its own </w:t>
+      </w:r>
+      <w:r>
+        <w:rPr>
+          <w:rFonts w:asciiTheme="majorBidi" w:hAnsiTheme="majorBidi" w:cstheme="majorBidi"/>
+          <w:b/>
+          <w:bCs/>
+          <w:i/>
+          <w:iCs/>
+          <w:sz w:val="28"/>
+          <w:szCs w:val="28"/>
+        </w:rPr>
+        <w:t>/</w:t>
       </w:r>
       <w:proofErr w:type="spellStart"/>
       <w:r>
         <w:rPr>
           <w:rFonts w:asciiTheme="majorBidi" w:hAnsiTheme="majorBidi" w:cstheme="majorBidi"/>
+          <w:b/>
+          <w:bCs/>
+          <w:i/>
+          <w:iCs/>
           <w:sz w:val="28"/>
           <w:szCs w:val="28"/>
         </w:rPr>
@@ -11612,6 +11683,10 @@
       <w:r>
         <w:rPr>
           <w:rFonts w:asciiTheme="majorBidi" w:hAnsiTheme="majorBidi" w:cstheme="majorBidi"/>
+          <w:b/>
+          <w:bCs/>
+          <w:i/>
+          <w:iCs/>
           <w:sz w:val="28"/>
           <w:szCs w:val="28"/>
         </w:rPr>
@@ -11621,6 +11696,10 @@
       <w:r>
         <w:rPr>
           <w:rFonts w:asciiTheme="majorBidi" w:hAnsiTheme="majorBidi" w:cstheme="majorBidi"/>
+          <w:b/>
+          <w:bCs/>
+          <w:i/>
+          <w:iCs/>
           <w:sz w:val="28"/>
           <w:szCs w:val="28"/>
         </w:rPr>
@@ -11640,6 +11719,7 @@
       <w:pPr>
         <w:spacing w:after="80"/>
         <w:ind w:left="360"/>
+        <w:jc w:val="both"/>
         <w:rPr>
           <w:rFonts w:asciiTheme="majorBidi" w:hAnsiTheme="majorBidi" w:cstheme="majorBidi"/>
           <w:sz w:val="28"/>
@@ -11664,6 +11744,7 @@
         </w:numPr>
         <w:spacing w:after="80"/>
         <w:ind w:left="720"/>
+        <w:jc w:val="both"/>
         <w:rPr>
           <w:rFonts w:asciiTheme="majorBidi" w:hAnsiTheme="majorBidi" w:cstheme="majorBidi"/>
           <w:b/>
@@ -12129,6 +12210,7 @@
       <w:pPr>
         <w:spacing w:after="80"/>
         <w:ind w:left="360"/>
+        <w:jc w:val="both"/>
         <w:rPr>
           <w:rFonts w:asciiTheme="majorBidi" w:hAnsiTheme="majorBidi" w:cstheme="majorBidi"/>
           <w:sz w:val="28"/>
@@ -12140,6 +12222,7 @@
       <w:pPr>
         <w:spacing w:after="80"/>
         <w:ind w:left="360"/>
+        <w:jc w:val="both"/>
         <w:rPr>
           <w:rFonts w:asciiTheme="majorBidi" w:hAnsiTheme="majorBidi" w:cstheme="majorBidi"/>
           <w:sz w:val="28"/>
@@ -12151,6 +12234,7 @@
       <w:pPr>
         <w:spacing w:after="80"/>
         <w:ind w:left="360"/>
+        <w:jc w:val="both"/>
         <w:rPr>
           <w:rFonts w:asciiTheme="majorBidi" w:hAnsiTheme="majorBidi" w:cstheme="majorBidi"/>
           <w:sz w:val="28"/>
@@ -12162,6 +12246,7 @@
       <w:pPr>
         <w:spacing w:after="80"/>
         <w:ind w:left="360"/>
+        <w:jc w:val="both"/>
         <w:rPr>
           <w:rFonts w:asciiTheme="majorBidi" w:hAnsiTheme="majorBidi" w:cstheme="majorBidi"/>
           <w:sz w:val="32"/>
@@ -12173,6 +12258,7 @@
       <w:pPr>
         <w:spacing w:after="80"/>
         <w:ind w:left="720"/>
+        <w:jc w:val="both"/>
         <w:rPr>
           <w:rFonts w:asciiTheme="majorBidi" w:hAnsiTheme="majorBidi" w:cstheme="majorBidi"/>
           <w:sz w:val="28"/>
@@ -12197,6 +12283,7 @@
         </w:numPr>
         <w:spacing w:after="80"/>
         <w:ind w:left="720"/>
+        <w:jc w:val="both"/>
         <w:rPr>
           <w:rFonts w:asciiTheme="majorBidi" w:hAnsiTheme="majorBidi" w:cstheme="majorBidi"/>
           <w:b/>
@@ -12509,6 +12596,7 @@
       <w:pPr>
         <w:spacing w:after="80"/>
         <w:ind w:left="360"/>
+        <w:jc w:val="both"/>
         <w:rPr>
           <w:rFonts w:asciiTheme="majorBidi" w:hAnsiTheme="majorBidi" w:cstheme="majorBidi"/>
           <w:sz w:val="28"/>
@@ -12563,6 +12651,7 @@
         </w:numPr>
         <w:spacing w:after="80"/>
         <w:ind w:left="720"/>
+        <w:jc w:val="both"/>
         <w:rPr>
           <w:rFonts w:asciiTheme="majorBidi" w:hAnsiTheme="majorBidi" w:cstheme="majorBidi"/>
           <w:sz w:val="28"/>
@@ -12599,6 +12688,7 @@
         </w:numPr>
         <w:spacing w:after="80"/>
         <w:ind w:left="720"/>
+        <w:jc w:val="both"/>
         <w:rPr>
           <w:rFonts w:asciiTheme="majorBidi" w:hAnsiTheme="majorBidi" w:cstheme="majorBidi"/>
           <w:sz w:val="28"/>
@@ -12635,6 +12725,7 @@
         </w:numPr>
         <w:spacing w:after="80"/>
         <w:ind w:left="720"/>
+        <w:jc w:val="both"/>
         <w:rPr>
           <w:rFonts w:asciiTheme="majorBidi" w:hAnsiTheme="majorBidi" w:cstheme="majorBidi"/>
           <w:sz w:val="28"/>
@@ -12671,6 +12762,7 @@
         </w:numPr>
         <w:spacing w:after="80"/>
         <w:ind w:left="720"/>
+        <w:jc w:val="both"/>
         <w:rPr>
           <w:rFonts w:asciiTheme="majorBidi" w:hAnsiTheme="majorBidi" w:cstheme="majorBidi"/>
           <w:sz w:val="28"/>
@@ -12707,6 +12799,7 @@
         </w:numPr>
         <w:spacing w:after="80"/>
         <w:ind w:left="720"/>
+        <w:jc w:val="both"/>
         <w:rPr>
           <w:rFonts w:asciiTheme="majorBidi" w:hAnsiTheme="majorBidi" w:cstheme="majorBidi"/>
           <w:sz w:val="28"/>
@@ -13519,6 +13612,7 @@
       <w:pPr>
         <w:spacing w:after="80"/>
         <w:ind w:left="720"/>
+        <w:jc w:val="both"/>
         <w:rPr>
           <w:rFonts w:asciiTheme="majorBidi" w:hAnsiTheme="majorBidi" w:cstheme="majorBidi"/>
           <w:b/>
@@ -13566,6 +13660,7 @@
       <w:pPr>
         <w:spacing w:after="60"/>
         <w:ind w:left="720"/>
+        <w:jc w:val="both"/>
         <w:rPr>
           <w:rFonts w:asciiTheme="majorBidi" w:hAnsiTheme="majorBidi" w:cstheme="majorBidi"/>
           <w:sz w:val="28"/>
@@ -13585,6 +13680,7 @@
       <w:pPr>
         <w:spacing w:after="140"/>
         <w:ind w:left="720"/>
+        <w:jc w:val="both"/>
         <w:rPr>
           <w:rFonts w:asciiTheme="majorBidi" w:hAnsiTheme="majorBidi" w:cstheme="majorBidi"/>
           <w:sz w:val="28"/>
@@ -14466,6 +14562,10 @@
       <w:r>
         <w:rPr>
           <w:rFonts w:asciiTheme="majorBidi" w:hAnsiTheme="majorBidi" w:cstheme="majorBidi"/>
+          <w:b/>
+          <w:bCs/>
+          <w:i/>
+          <w:iCs/>
           <w:sz w:val="28"/>
           <w:szCs w:val="28"/>
         </w:rPr>

</xml_diff>